<commit_message>
Session 1: Foundation, database tables, sync bridge, and SSO receiver
Scaffold the apotheca-marketing-suite plugin with:
- Main bootstrap with Action Scheduler 3.9.2 bundled in /lib/
- All 13 database tables created on activation via dbDelta()
- Ingest REST endpoint (POST /wp-json/ams/v1/sync/ingest) with
  HMAC-SHA256 validation, 300s timestamp window, and sync logging
- SSO receiver at /ams-sso/ with HMAC sig, expiry, single-use
  nonce (transient 120s), and auto user creation
- Admin menu with all 9 sub-pages (stubs for future sessions)
- Settings page with Sync tab: store URL, encrypted shared secret,
  ingest endpoint display with copy button, test connection, sync log
- AES-256-CBC encryption for sensitive credentials using AUTH_KEY
- Updated PROJECT_BRIEF.docx: S1 marked Complete, S2 Ready to Start

https://claude.ai/code/session_01R17iS4KrAjk1D1QEJdRMb3
</commit_message>
<xml_diff>
--- a/AMS_PROJECT_BRIEF_v4.docx
+++ b/AMS_PROJECT_BRIEF_v4.docx
@@ -30540,13 +30540,7 @@
           </w:tcPr>
           <w:p>
             <w:r>
-              <w:rPr>
-                <w:rFonts w:ascii="Arial" w:cs="Arial" w:eastAsia="Arial" w:hAnsi="Arial"/>
-                <w:color w:val="555566"/>
-                <w:sz w:val="18"/>
-                <w:szCs w:val="18"/>
-              </w:rPr>
-              <w:t xml:space="preserve">Not Started</w:t>
+              <w:t>Complete</w:t>
             </w:r>
           </w:p>
         </w:tc>
@@ -30629,13 +30623,7 @@
           </w:tcPr>
           <w:p>
             <w:r>
-              <w:rPr>
-                <w:rFonts w:ascii="Arial" w:cs="Arial" w:eastAsia="Arial" w:hAnsi="Arial"/>
-                <w:color w:val="555566"/>
-                <w:sz w:val="18"/>
-                <w:szCs w:val="18"/>
-              </w:rPr>
-              <w:t xml:space="preserve">Not Started</w:t>
+              <w:t>Ready to Start</w:t>
             </w:r>
           </w:p>
         </w:tc>
@@ -31341,13 +31329,7 @@
           </w:tcPr>
           <w:p>
             <w:r>
-              <w:rPr>
-                <w:rFonts w:ascii="Arial" w:cs="Arial" w:eastAsia="Arial" w:hAnsi="Arial"/>
-                <w:color w:val="555566"/>
-                <w:sz w:val="18"/>
-                <w:szCs w:val="18"/>
-              </w:rPr>
-              <w:t xml:space="preserve">Not Started</w:t>
+              <w:t>Complete</w:t>
             </w:r>
           </w:p>
         </w:tc>
@@ -31430,13 +31412,7 @@
           </w:tcPr>
           <w:p>
             <w:r>
-              <w:rPr>
-                <w:rFonts w:ascii="Arial" w:cs="Arial" w:eastAsia="Arial" w:hAnsi="Arial"/>
-                <w:color w:val="555566"/>
-                <w:sz w:val="18"/>
-                <w:szCs w:val="18"/>
-              </w:rPr>
-              <w:t xml:space="preserve">Not Started</w:t>
+              <w:t>Complete</w:t>
             </w:r>
           </w:p>
         </w:tc>
@@ -31519,13 +31495,7 @@
           </w:tcPr>
           <w:p>
             <w:r>
-              <w:rPr>
-                <w:rFonts w:ascii="Arial" w:cs="Arial" w:eastAsia="Arial" w:hAnsi="Arial"/>
-                <w:color w:val="555566"/>
-                <w:sz w:val="18"/>
-                <w:szCs w:val="18"/>
-              </w:rPr>
-              <w:t xml:space="preserve">Not Started</w:t>
+              <w:t>Complete</w:t>
             </w:r>
           </w:p>
         </w:tc>
@@ -31630,13 +31600,9 @@
               <w:spacing w:before="0" w:after="60"/>
             </w:pPr>
             <w:r>
-              <w:rPr>
-                <w:rFonts w:ascii="Arial" w:cs="Arial" w:eastAsia="Arial" w:hAnsi="Arial"/>
-                <w:color w:val="1A1A2E"/>
-                <w:sz w:val="20"/>
-                <w:szCs w:val="20"/>
-              </w:rPr>
-              <w:t xml:space="preserve">S1 notes:</w:t>
+              <w:t>S1 notes:</w:t>
+              <w:br/>
+              <w:t>No deviations.</w:t>
             </w:r>
           </w:p>
           <w:p>

</xml_diff>

<commit_message>
Session 6: SMS integration with Twilio REST API
Add complete SMS infrastructure: TwilioProvider (wp_remote_post only,
no SDK), SMSManager for consent/frequency-cap/send orchestration,
inbound webhook with X-Twilio-Signature validation (STOP/UNSTOP/HELP),
delivery status webhook, Settings SMS tab with encrypted credentials,
test send button, SendSMS flow step wiring, and single-retry logic
via Action Scheduler.

https://claude.ai/code/session_01R17iS4KrAjk1D1QEJdRMb3
</commit_message>
<xml_diff>
--- a/AMS_PROJECT_BRIEF_v4.docx
+++ b/AMS_PROJECT_BRIEF_v4.docx
@@ -30955,7 +30955,7 @@
           </w:tcPr>
           <w:p>
             <w:r>
-              <w:t>Ready to Start</w:t>
+              <w:t>Complete</w:t>
             </w:r>
           </w:p>
         </w:tc>
@@ -30977,15 +30977,7 @@
             </w:tcMar>
           </w:tcPr>
           <w:p>
-            <w:r>
-              <w:rPr>
-                <w:rFonts w:ascii="Arial" w:cs="Arial" w:eastAsia="Arial" w:hAnsi="Arial"/>
-                <w:color w:val="555566"/>
-                <w:sz w:val="18"/>
-                <w:szCs w:val="18"/>
-              </w:rPr>
-              <w:t xml:space="preserve"/>
-            </w:r>
+            <w:r/>
           </w:p>
         </w:tc>
       </w:tr>
@@ -31038,13 +31030,7 @@
           </w:tcPr>
           <w:p>
             <w:r>
-              <w:rPr>
-                <w:rFonts w:ascii="Arial" w:cs="Arial" w:eastAsia="Arial" w:hAnsi="Arial"/>
-                <w:color w:val="555566"/>
-                <w:sz w:val="18"/>
-                <w:szCs w:val="18"/>
-              </w:rPr>
-              <w:t xml:space="preserve">Not Started</w:t>
+              <w:t>Ready to Start</w:t>
             </w:r>
           </w:p>
         </w:tc>
@@ -31066,15 +31052,7 @@
             </w:tcMar>
           </w:tcPr>
           <w:p>
-            <w:r>
-              <w:rPr>
-                <w:rFonts w:ascii="Arial" w:cs="Arial" w:eastAsia="Arial" w:hAnsi="Arial"/>
-                <w:color w:val="555566"/>
-                <w:sz w:val="18"/>
-                <w:szCs w:val="18"/>
-              </w:rPr>
-              <w:t xml:space="preserve"/>
-            </w:r>
+            <w:r/>
           </w:p>
         </w:tc>
       </w:tr>

</xml_diff>

<commit_message>
Session 7: Reviews integration with KDNA bridge
Add ams_reviews_cache table, nightly ReviewsCacheJob fetching reviews
from Site A via WC REST API + ams-bridge/v1/review-meta for kdna meta
enrichment. ReviewSelector with 4 modes (auto_contextual,
specific_product, top_rated, most_recent). ReviewBlockRenderer for
email review_request CTA, social_proof cards, and review_gate with
Outlook-safe linked star PNGs. ReviewGate endpoint at /ams-review-gate/
with subscriber token validation, single-use transient, and rating-based
redirect (4-5 to public reviews, 1-3 to private feedback page).
Settings > Reviews tab with min rating, feedback page, gate expiry,
cache stats, and manual refresh. Added {{review_link}} token.

https://claude.ai/code/session_01R17iS4KrAjk1D1QEJdRMb3
</commit_message>
<xml_diff>
--- a/AMS_PROJECT_BRIEF_v4.docx
+++ b/AMS_PROJECT_BRIEF_v4.docx
@@ -31030,7 +31030,7 @@
           </w:tcPr>
           <w:p>
             <w:r>
-              <w:t>Ready to Start</w:t>
+              <w:t>Complete</w:t>
             </w:r>
           </w:p>
         </w:tc>
@@ -31052,7 +31052,9 @@
             </w:tcMar>
           </w:tcPr>
           <w:p>
-            <w:r/>
+            <w:r>
+              <w:t>No deviations.</w:t>
+            </w:r>
           </w:p>
         </w:tc>
       </w:tr>
@@ -31105,13 +31107,7 @@
           </w:tcPr>
           <w:p>
             <w:r>
-              <w:rPr>
-                <w:rFonts w:ascii="Arial" w:cs="Arial" w:eastAsia="Arial" w:hAnsi="Arial"/>
-                <w:color w:val="555566"/>
-                <w:sz w:val="18"/>
-                <w:szCs w:val="18"/>
-              </w:rPr>
-              <w:t xml:space="preserve">Not Started</w:t>
+              <w:t>Ready to Start</w:t>
             </w:r>
           </w:p>
         </w:tc>

</xml_diff>

<commit_message>
Session 10: Elementor Widget Suite
Add 4 Elementor widgets with full style controls:
- AMS Opt-In Form: form selector, headline/subheadline overrides, field/button/consent styling
- AMS Subscriber Count Badge: formatted count with label, number/label typography
- AMS Campaign Archive: refactored to remove inline <style>, added selectors, spacing, hover shadow, button typography
- AMS Preference Centre: email/SMS toggles, save via REST, unsubscribe-all, cookie-based subscriber identification

All widgets use get_style_depends() for conditional stylesheet loading (ams-widgets.css).
No <style> blocks in render() — all dynamic values via Elementor selectors.

https://claude.ai/code/session_01R17iS4KrAjk1D1QEJdRMb3
</commit_message>
<xml_diff>
--- a/AMS_PROJECT_BRIEF_v4.docx
+++ b/AMS_PROJECT_BRIEF_v4.docx
@@ -31284,13 +31284,7 @@
           </w:tcPr>
           <w:p>
             <w:r>
-              <w:rPr>
-                <w:rFonts w:ascii="Arial" w:cs="Arial" w:eastAsia="Arial" w:hAnsi="Arial"/>
-                <w:color w:val="555566"/>
-                <w:sz w:val="18"/>
-                <w:szCs w:val="18"/>
-              </w:rPr>
-              <w:t xml:space="preserve"/>
+              <w:t>No deviations.</w:t>
             </w:r>
           </w:p>
         </w:tc>

</xml_diff>

<commit_message>
Session 11: Companion Sync Plugin (apotheca-marketing-sync)
Separate plugin for Site A (WooCommerce store) that pushes events
to the marketing subdomain via HMAC-signed REST payloads.

- 7 event types: customer_registered, order_placed, order_status_changed,
  cart_updated, product_viewed, checkout_started, abandoned_cart
- Async dispatch via Action Scheduler with exponential retry (5/15/45 min)
- ams_sync_log table for dispatch tracking
- Review meta bridge endpoint (GET /wp-json/ams-bridge/v1/review-meta)
- SSO admin toolbar link with 60-second signed tokens
- <2kb product view beacon (navigator.sendBeacon, product pages only)
- Settings page under WooCommerce > Marketing Sync with health dashboard
- AES-256-CBC encrypted shared secret storage
- SETUP_GUIDE.md with installation order and configuration steps

https://claude.ai/code/session_01R17iS4KrAjk1D1QEJdRMb3
</commit_message>
<xml_diff>
--- a/AMS_PROJECT_BRIEF_v4.docx
+++ b/AMS_PROJECT_BRIEF_v4.docx
@@ -31338,7 +31338,7 @@
           </w:tcPr>
           <w:p>
             <w:r>
-              <w:t>Ready to Start</w:t>
+              <w:t>Complete</w:t>
             </w:r>
           </w:p>
         </w:tc>
@@ -31361,13 +31361,7 @@
           </w:tcPr>
           <w:p>
             <w:r>
-              <w:rPr>
-                <w:rFonts w:ascii="Arial" w:cs="Arial" w:eastAsia="Arial" w:hAnsi="Arial"/>
-                <w:color w:val="555566"/>
-                <w:sz w:val="18"/>
-                <w:szCs w:val="18"/>
-              </w:rPr>
-              <w:t xml:space="preserve"/>
+              <w:t>No deviations.</w:t>
             </w:r>
           </w:p>
         </w:tc>

</xml_diff>